<commit_message>
파일삭제, 정리 후 run_management_no_preprocessing.py생성
</commit_message>
<xml_diff>
--- a/report_agent/output/management_reports/management_review_order.docx
+++ b/report_agent/output/management_reports/management_review_order.docx
@@ -64,7 +64,7 @@
           <w:sz w:val="60"/>
           <w:lang w:eastAsia="ko-KR"/>
         </w:rPr>
-        <w:t>-</w:t>
+        <w:t>경영책임자 검토지시서</w:t>
       </w:r>
     </w:p>
     <w:p>
@@ -228,7 +228,7 @@
                 <w:rFonts w:hint="eastAsia"/>
                 <w:lang w:eastAsia="ko-KR"/>
               </w:rPr>
-              <w:t>-</w:t>
+              <w:t>경영책임자 검토지시서</w:t>
             </w:r>
           </w:p>
         </w:tc>
@@ -352,7 +352,7 @@
           </w:tcPr>
           <w:p>
             <w:r>
-              <w:t>-</w:t>
+              <w:t>2026-07-28 ~ 2026-08-03</w:t>
             </w:r>
           </w:p>
         </w:tc>
@@ -421,7 +421,7 @@
                 <w:rFonts w:hint="eastAsia"/>
                 <w:lang w:eastAsia="ko-KR"/>
               </w:rPr>
-              <w:t>2026-08-06</w:t>
+              <w:t>2026-08-07</w:t>
             </w:r>
           </w:p>
         </w:tc>
@@ -638,7 +638,7 @@
                 <w:rFonts w:hint="eastAsia"/>
                 <w:lang w:eastAsia="ko-KR"/>
               </w:rPr>
-              <w:t>-</w:t>
+              <w:t>C동 하역장과 B동 자재창고에서 동일 위험 유형이 반복 발생하고 있으며, 특히 C동 하역장의 충돌 위험은 중간 위험도로 4회 반복되었다. 집과 기석님 집에서 발생한 고위험 화재 감지 위험은 조치 및 승인 모두 미완료 상태로 즉각적인 대응이 필요. 전체 점검 기록 중 절반 이상이 조치 미완료 또는 승인 대기 상태로 신속한 조치와 승인 절차 이행이 요구된다. 반복 위험에 대한 기존 조치의 효과성 검토와 재발 방지 대책 마련이 필요.</w:t>
             </w:r>
           </w:p>
         </w:tc>
@@ -919,7 +919,7 @@
                 <w:rFonts w:hint="eastAsia"/>
                 <w:sz w:val="16"/>
               </w:rPr>
-              <w:t>-</w:t>
+              <w:t>C동 하역장</w:t>
             </w:r>
           </w:p>
         </w:tc>
@@ -944,7 +944,7 @@
                 <w:rFonts w:hint="eastAsia"/>
                 <w:sz w:val="16"/>
               </w:rPr>
-              <w:t>-</w:t>
+              <w:t>충돌</w:t>
             </w:r>
           </w:p>
         </w:tc>
@@ -968,7 +968,7 @@
               <w:rPr>
                 <w:sz w:val="16"/>
               </w:rPr>
-              <w:t>-</w:t>
+              <w:t>MEDIUM</w:t>
             </w:r>
           </w:p>
         </w:tc>
@@ -996,7 +996,111 @@
                 <w:sz w:val="16"/>
                 <w:lang w:eastAsia="ko-KR"/>
               </w:rPr>
-              <w:t>-</w:t>
+              <w:t>관리 수준 점검 필요, 미조치 또는 승인 대기 현황 확인 필요, 반복 발생 관리 기준 보완 필요</w:t>
+            </w:r>
+          </w:p>
+        </w:tc>
+      </w:tr>
+      <w:tr>
+        <w:tc>
+          <w:tcPr>
+            <w:tcW w:w="1077" w:type="dxa"/>
+            <w:shd w:val="clear" w:color="auto" w:fill="FFFFFF"/>
+            <w:tcMar>
+              <w:top w:w="100" w:type="dxa"/>
+              <w:left w:w="70" w:type="dxa"/>
+              <w:bottom w:w="100" w:type="dxa"/>
+              <w:right w:w="70" w:type="dxa"/>
+            </w:tcMar>
+            <w:vAlign w:val="center"/>
+          </w:tcPr>
+          <w:p>
+            <w:pPr>
+              <w:jc w:val="center"/>
+            </w:pPr>
+            <w:r>
+              <w:rPr>
+                <w:rFonts w:hint="eastAsia"/>
+                <w:sz w:val="16"/>
+              </w:rPr>
+              <w:t>B동 자재창고</w:t>
+            </w:r>
+          </w:p>
+        </w:tc>
+        <w:tc>
+          <w:tcPr>
+            <w:tcW w:w="1323" w:type="dxa"/>
+            <w:shd w:val="clear" w:color="auto" w:fill="FFFFFF"/>
+            <w:tcMar>
+              <w:top w:w="100" w:type="dxa"/>
+              <w:left w:w="70" w:type="dxa"/>
+              <w:bottom w:w="100" w:type="dxa"/>
+              <w:right w:w="70" w:type="dxa"/>
+            </w:tcMar>
+            <w:vAlign w:val="center"/>
+          </w:tcPr>
+          <w:p>
+            <w:pPr>
+              <w:jc w:val="center"/>
+            </w:pPr>
+            <w:r>
+              <w:rPr>
+                <w:rFonts w:hint="eastAsia"/>
+                <w:sz w:val="16"/>
+              </w:rPr>
+              <w:t>적재물</w:t>
+            </w:r>
+          </w:p>
+        </w:tc>
+        <w:tc>
+          <w:tcPr>
+            <w:tcW w:w="1386" w:type="dxa"/>
+            <w:shd w:val="clear" w:color="auto" w:fill="FFFFFF"/>
+            <w:tcMar>
+              <w:top w:w="100" w:type="dxa"/>
+              <w:left w:w="70" w:type="dxa"/>
+              <w:bottom w:w="100" w:type="dxa"/>
+              <w:right w:w="70" w:type="dxa"/>
+            </w:tcMar>
+            <w:vAlign w:val="center"/>
+          </w:tcPr>
+          <w:p>
+            <w:pPr>
+              <w:jc w:val="center"/>
+            </w:pPr>
+            <w:r>
+              <w:rPr>
+                <w:sz w:val="16"/>
+              </w:rPr>
+              <w:t>MEDIUM</w:t>
+            </w:r>
+          </w:p>
+        </w:tc>
+        <w:tc>
+          <w:tcPr>
+            <w:tcW w:w="6349" w:type="dxa"/>
+            <w:shd w:val="clear" w:color="auto" w:fill="FFFFFF"/>
+            <w:tcMar>
+              <w:top w:w="100" w:type="dxa"/>
+              <w:left w:w="70" w:type="dxa"/>
+              <w:bottom w:w="100" w:type="dxa"/>
+              <w:right w:w="70" w:type="dxa"/>
+            </w:tcMar>
+            <w:vAlign w:val="center"/>
+          </w:tcPr>
+          <w:p>
+            <w:pPr>
+              <w:rPr>
+                <w:lang w:eastAsia="ko-KR"/>
+              </w:rPr>
+            </w:pPr>
+            <w:r>
+              <w:rPr>
+                <w:rFonts w:hint="eastAsia"/>
+                <w:sz w:val="16"/>
+                <w:lang w:eastAsia="ko-KR"/>
+              </w:rPr>
+              <w:t>정기 모니터링 필요, 미조치 또는 승인 대기 현황 확인 필요</w:t>
             </w:r>
           </w:p>
         </w:tc>
@@ -1045,7 +1149,7 @@
                 <w:sz w:val="18"/>
                 <w:lang w:eastAsia="ko-KR"/>
               </w:rPr>
-              <w:t>-</w:t>
+              <w:t>위 표는 동일 구역과 동일 위험 유형이 반복 기록된 후보를 기준으로 정리한 것이다. 반복 위험 그룹은 2건, 고위험 기록은 4건, 미조치 또는 승인 대기 기록은 9건이다.</w:t>
             </w:r>
           </w:p>
         </w:tc>
@@ -1224,7 +1328,7 @@
                 <w:sz w:val="20"/>
                 <w:lang w:eastAsia="ko-KR"/>
               </w:rPr>
-              <w:t>-</w:t>
+              <w:t>안전관리부서는 C동 하역장과 B동 자재창고에서 반복 발생하는 위험에 대해 기존 조치의 효과성을 검토하고, 재발 방지 대책을 수립할 것.</w:t>
             </w:r>
           </w:p>
         </w:tc>
@@ -1297,7 +1401,7 @@
                 <w:sz w:val="20"/>
                 <w:lang w:eastAsia="ko-KR"/>
               </w:rPr>
-              <w:t>-</w:t>
+              <w:t>현장관리자는 집과 기석님 집에서 발생한 고위험 화재 감지 위험에 대해 즉각적인 조치 및 승인 절차를 완료할 것.</w:t>
             </w:r>
           </w:p>
         </w:tc>
@@ -1370,7 +1474,7 @@
                 <w:sz w:val="20"/>
                 <w:lang w:eastAsia="ko-KR"/>
               </w:rPr>
-              <w:t>-</w:t>
+              <w:t>담당 부서는 조치 및 승인 미완료 상태인 점검 기록에 대해 신속한 이행을 독려하고, 미조치 항목에 대한 관리 체계를 강화할 것.</w:t>
             </w:r>
           </w:p>
         </w:tc>
@@ -1443,7 +1547,7 @@
                 <w:sz w:val="20"/>
                 <w:lang w:eastAsia="ko-KR"/>
               </w:rPr>
-              <w:t>-</w:t>
+              <w:t>안전관리부서는 정기 점검 프로세스의 실효성을 점검하고, 반복 위험 발생 구역에 대한 집중 관리 방안을 마련할 것.</w:t>
             </w:r>
           </w:p>
         </w:tc>
@@ -1516,7 +1620,7 @@
                 <w:sz w:val="20"/>
                 <w:lang w:eastAsia="ko-KR"/>
               </w:rPr>
-              <w:t>-</w:t>
+              <w:t>경영책임자는 위험 발생 현황과 조치 진행 상황을 주기적으로 모니터링할 수 있는 보고 체계를 구축할 것.</w:t>
             </w:r>
           </w:p>
         </w:tc>
@@ -1669,7 +1773,7 @@
                 <w:sz w:val="22"/>
                 <w:lang w:eastAsia="ko-KR"/>
               </w:rPr>
-              <w:t>-</w:t>
+              <w:t>본 검토 결과 C동 하역장과 B동 자재창고에서 동일 위험 유형이 반복 발생하고 있으며, 조치 및 승인 미완료 상태가 다수 확인됐다. 집과 기석님 집에서 발생한 고위험 화재 감지 위험은 즉각적인 대응이 필요하다. 반복 위험 관리와 조치 이행 점검을 우선 관리 대상으로 정한다. 재발 방지 대책을 마련하고 조치 및 승인 절차의 신속한 이행을 확보한다. 위험 발생 현황과 조치 진행 상황을 주기적으로 모니터링할 수 있는 보고 체계를 구축하여 지속적인 안전 관리를 강화한다.</w:t>
             </w:r>
           </w:p>
         </w:tc>

</xml_diff>